<commit_message>
kafka docker compose added
</commit_message>
<xml_diff>
--- a/Microservices Architecture with Java and Spring Boot_v3.docx
+++ b/Microservices Architecture with Java and Spring Boot_v3.docx
@@ -1514,23 +1514,36 @@
         <w:rPr>
           <w:b/>
           <w:bCs/>
-        </w:rPr>
-      </w:pPr>
-      <w:r>
+          <w:highlight w:val="yellow"/>
+        </w:rPr>
+      </w:pPr>
+    </w:p>
+    <w:p>
+      <w:pPr>
+        <w:spacing w:after="0"/>
         <w:rPr>
           <w:b/>
           <w:bCs/>
           <w:highlight w:val="yellow"/>
         </w:rPr>
-        <w:t>1</w:t>
-      </w:r>
+      </w:pPr>
+    </w:p>
+    <w:p>
+      <w:pPr>
+        <w:spacing w:after="0"/>
+        <w:rPr>
+          <w:b/>
+          <w:bCs/>
+        </w:rPr>
+      </w:pPr>
       <w:r>
         <w:rPr>
           <w:b/>
           <w:bCs/>
           <w:highlight w:val="yellow"/>
         </w:rPr>
-        <w:t>3</w:t>
+        <w:lastRenderedPageBreak/>
+        <w:t>1</w:t>
       </w:r>
       <w:r>
         <w:rPr>
@@ -1538,7 +1551,7 @@
           <w:bCs/>
           <w:highlight w:val="yellow"/>
         </w:rPr>
-        <w:t xml:space="preserve">. </w:t>
+        <w:t>3</w:t>
       </w:r>
       <w:r>
         <w:rPr>
@@ -1546,6 +1559,14 @@
           <w:bCs/>
           <w:highlight w:val="yellow"/>
         </w:rPr>
+        <w:t xml:space="preserve">. </w:t>
+      </w:r>
+      <w:r>
+        <w:rPr>
+          <w:b/>
+          <w:bCs/>
+          <w:highlight w:val="yellow"/>
+        </w:rPr>
         <w:t>Monitoring &amp; Logging</w:t>
       </w:r>
     </w:p>
@@ -1564,7 +1585,6 @@
         <w:spacing w:after="0"/>
       </w:pPr>
       <w:r>
-        <w:lastRenderedPageBreak/>
         <w:t>Centralized logging</w:t>
       </w:r>
     </w:p>
@@ -2076,6 +2096,7 @@
         <w:spacing w:after="0"/>
       </w:pPr>
       <w:r>
+        <w:lastRenderedPageBreak/>
         <w:t>Docker Compose</w:t>
       </w:r>
     </w:p>
@@ -2102,7 +2123,6 @@
         <w:spacing w:after="0"/>
       </w:pPr>
       <w:r>
-        <w:lastRenderedPageBreak/>
         <w:t>Deployment to Kubernetes Cluster (Local)</w:t>
       </w:r>
     </w:p>

</xml_diff>